<commit_message>
Specs for the work of 16 and 17 October 2026 that had none
Overlay importers v2 (the audited overrides as built and applied), PD pools v1, the production
copy upgrade and hosting runbook, and an addendum for nine changes of the 16 October release;
the decisions pack table in the staging spec and three stale status lines brought up to date.

Co-Authored-By: Claude Opus 5.5 <noreply@anthropic.com>
</commit_message>
<xml_diff>
--- a/docs/MAIIC_Held_Fee_Classification_Export_Reimport_Specification_v1_2026-10-16.docx
+++ b/docs/MAIIC_Held_Fee_Classification_Export_Reimport_Specification_v1_2026-10-16.docx
@@ -53,7 +53,7 @@
           <w:color w:val="5B6470"/>
           <w:sz w:val="18"/>
         </w:rPr>
-        <w:t>Scope note, revision 3. Next build item after the GL fee route (spec v4 sections 7.8.3 to 7.8.5).</w:t>
+        <w:t>Built and merged 16 October 2026 (commit 5cbb5bf; HeldFeeClassificationImportService, table fee_gl_held_notes). Scope note, revision 3.</w:t>
       </w:r>
     </w:p>
     <w:p>
@@ -525,6 +525,10 @@
         <w:gridCol w:w="2493"/>
       </w:tblGrid>
       <w:tr>
+        <w:trPr>
+          <w:cantSplit/>
+          <w:tblHeader/>
+        </w:trPr>
         <w:tc>
           <w:tcPr>
             <w:tcW w:type="dxa" w:w="2493"/>
@@ -623,6 +627,9 @@
         </w:tc>
       </w:tr>
       <w:tr>
+        <w:trPr>
+          <w:cantSplit/>
+        </w:trPr>
         <w:tc>
           <w:tcPr>
             <w:tcW w:type="dxa" w:w="2493"/>
@@ -709,6 +716,9 @@
         </w:tc>
       </w:tr>
       <w:tr>
+        <w:trPr>
+          <w:cantSplit/>
+        </w:trPr>
         <w:tc>
           <w:tcPr>
             <w:tcW w:type="dxa" w:w="2493"/>
@@ -795,6 +805,9 @@
         </w:tc>
       </w:tr>
       <w:tr>
+        <w:trPr>
+          <w:cantSplit/>
+        </w:trPr>
         <w:tc>
           <w:tcPr>
             <w:tcW w:type="dxa" w:w="2493"/>
@@ -881,6 +894,9 @@
         </w:tc>
       </w:tr>
       <w:tr>
+        <w:trPr>
+          <w:cantSplit/>
+        </w:trPr>
         <w:tc>
           <w:tcPr>
             <w:tcW w:type="dxa" w:w="2493"/>
@@ -1017,6 +1033,10 @@
         <w:gridCol w:w="4986"/>
       </w:tblGrid>
       <w:tr>
+        <w:trPr>
+          <w:cantSplit/>
+          <w:tblHeader/>
+        </w:trPr>
         <w:tc>
           <w:tcPr>
             <w:tcW w:type="dxa" w:w="4986"/>
@@ -1067,6 +1087,9 @@
         </w:tc>
       </w:tr>
       <w:tr>
+        <w:trPr>
+          <w:cantSplit/>
+        </w:trPr>
         <w:tc>
           <w:tcPr>
             <w:tcW w:type="dxa" w:w="4986"/>
@@ -1111,6 +1134,9 @@
         </w:tc>
       </w:tr>
       <w:tr>
+        <w:trPr>
+          <w:cantSplit/>
+        </w:trPr>
         <w:tc>
           <w:tcPr>
             <w:tcW w:type="dxa" w:w="4986"/>
@@ -1155,6 +1181,9 @@
         </w:tc>
       </w:tr>
       <w:tr>
+        <w:trPr>
+          <w:cantSplit/>
+        </w:trPr>
         <w:tc>
           <w:tcPr>
             <w:tcW w:type="dxa" w:w="4986"/>
@@ -1199,6 +1228,9 @@
         </w:tc>
       </w:tr>
       <w:tr>
+        <w:trPr>
+          <w:cantSplit/>
+        </w:trPr>
         <w:tc>
           <w:tcPr>
             <w:tcW w:type="dxa" w:w="4986"/>
@@ -3095,6 +3127,10 @@
         <w:gridCol w:w="3324"/>
       </w:tblGrid>
       <w:tr>
+        <w:trPr>
+          <w:cantSplit/>
+          <w:tblHeader/>
+        </w:trPr>
         <w:tc>
           <w:tcPr>
             <w:tcW w:type="dxa" w:w="3324"/>
@@ -3169,6 +3205,9 @@
         </w:tc>
       </w:tr>
       <w:tr>
+        <w:trPr>
+          <w:cantSplit/>
+        </w:trPr>
         <w:tc>
           <w:tcPr>
             <w:tcW w:type="dxa" w:w="3324"/>
@@ -3244,6 +3283,9 @@
         </w:tc>
       </w:tr>
       <w:tr>
+        <w:trPr>
+          <w:cantSplit/>
+        </w:trPr>
         <w:tc>
           <w:tcPr>
             <w:tcW w:type="dxa" w:w="3324"/>
@@ -3327,6 +3369,9 @@
         </w:tc>
       </w:tr>
       <w:tr>
+        <w:trPr>
+          <w:cantSplit/>
+        </w:trPr>
         <w:tc>
           <w:tcPr>
             <w:tcW w:type="dxa" w:w="3324"/>
@@ -3461,6 +3506,9 @@
         </w:tc>
       </w:tr>
       <w:tr>
+        <w:trPr>
+          <w:cantSplit/>
+        </w:trPr>
         <w:tc>
           <w:tcPr>
             <w:tcW w:type="dxa" w:w="3324"/>
@@ -3527,6 +3575,9 @@
         </w:tc>
       </w:tr>
       <w:tr>
+        <w:trPr>
+          <w:cantSplit/>
+        </w:trPr>
         <w:tc>
           <w:tcPr>
             <w:tcW w:type="dxa" w:w="3324"/>
@@ -3593,6 +3644,9 @@
         </w:tc>
       </w:tr>
       <w:tr>
+        <w:trPr>
+          <w:cantSplit/>
+        </w:trPr>
         <w:tc>
           <w:tcPr>
             <w:tcW w:type="dxa" w:w="3324"/>
@@ -3675,6 +3729,9 @@
         </w:tc>
       </w:tr>
       <w:tr>
+        <w:trPr>
+          <w:cantSplit/>
+        </w:trPr>
         <w:tc>
           <w:tcPr>
             <w:tcW w:type="dxa" w:w="3324"/>
@@ -3758,6 +3815,9 @@
         </w:tc>
       </w:tr>
       <w:tr>
+        <w:trPr>
+          <w:cantSplit/>
+        </w:trPr>
         <w:tc>
           <w:tcPr>
             <w:tcW w:type="dxa" w:w="3324"/>
@@ -3841,6 +3901,9 @@
         </w:tc>
       </w:tr>
       <w:tr>
+        <w:trPr>
+          <w:cantSplit/>
+        </w:trPr>
         <w:tc>
           <w:tcPr>
             <w:tcW w:type="dxa" w:w="3324"/>
@@ -3907,6 +3970,9 @@
         </w:tc>
       </w:tr>
       <w:tr>
+        <w:trPr>
+          <w:cantSplit/>
+        </w:trPr>
         <w:tc>
           <w:tcPr>
             <w:tcW w:type="dxa" w:w="3324"/>
@@ -3991,6 +4057,9 @@
         </w:tc>
       </w:tr>
       <w:tr>
+        <w:trPr>
+          <w:cantSplit/>
+        </w:trPr>
         <w:tc>
           <w:tcPr>
             <w:tcW w:type="dxa" w:w="3324"/>
@@ -4125,6 +4194,9 @@
         </w:tc>
       </w:tr>
       <w:tr>
+        <w:trPr>
+          <w:cantSplit/>
+        </w:trPr>
         <w:tc>
           <w:tcPr>
             <w:tcW w:type="dxa" w:w="3324"/>
@@ -4217,6 +4289,9 @@
         </w:tc>
       </w:tr>
       <w:tr>
+        <w:trPr>
+          <w:cantSplit/>
+        </w:trPr>
         <w:tc>
           <w:tcPr>
             <w:tcW w:type="dxa" w:w="3324"/>
@@ -4342,6 +4417,9 @@
         </w:tc>
       </w:tr>
       <w:tr>
+        <w:trPr>
+          <w:cantSplit/>
+        </w:trPr>
         <w:tc>
           <w:tcPr>
             <w:tcW w:type="dxa" w:w="3324"/>
@@ -8564,6 +8642,10 @@
         <w:gridCol w:w="4986"/>
       </w:tblGrid>
       <w:tr>
+        <w:trPr>
+          <w:cantSplit/>
+          <w:tblHeader/>
+        </w:trPr>
         <w:tc>
           <w:tcPr>
             <w:tcW w:type="dxa" w:w="4986"/>
@@ -8614,6 +8696,9 @@
         </w:tc>
       </w:tr>
       <w:tr>
+        <w:trPr>
+          <w:cantSplit/>
+        </w:trPr>
         <w:tc>
           <w:tcPr>
             <w:tcW w:type="dxa" w:w="4986"/>
@@ -8658,6 +8743,9 @@
         </w:tc>
       </w:tr>
       <w:tr>
+        <w:trPr>
+          <w:cantSplit/>
+        </w:trPr>
         <w:tc>
           <w:tcPr>
             <w:tcW w:type="dxa" w:w="4986"/>
@@ -8702,6 +8790,9 @@
         </w:tc>
       </w:tr>
       <w:tr>
+        <w:trPr>
+          <w:cantSplit/>
+        </w:trPr>
         <w:tc>
           <w:tcPr>
             <w:tcW w:type="dxa" w:w="4986"/>
@@ -8746,6 +8837,9 @@
         </w:tc>
       </w:tr>
       <w:tr>
+        <w:trPr>
+          <w:cantSplit/>
+        </w:trPr>
         <w:tc>
           <w:tcPr>
             <w:tcW w:type="dxa" w:w="4986"/>
@@ -8807,6 +8901,9 @@
         </w:tc>
       </w:tr>
       <w:tr>
+        <w:trPr>
+          <w:cantSplit/>
+        </w:trPr>
         <w:tc>
           <w:tcPr>
             <w:tcW w:type="dxa" w:w="4986"/>
@@ -8860,6 +8957,9 @@
         </w:tc>
       </w:tr>
       <w:tr>
+        <w:trPr>
+          <w:cantSplit/>
+        </w:trPr>
         <w:tc>
           <w:tcPr>
             <w:tcW w:type="dxa" w:w="4986"/>
@@ -8904,6 +9004,9 @@
         </w:tc>
       </w:tr>
       <w:tr>
+        <w:trPr>
+          <w:cantSplit/>
+        </w:trPr>
         <w:tc>
           <w:tcPr>
             <w:tcW w:type="dxa" w:w="4986"/>
@@ -8981,6 +9084,9 @@
         </w:tc>
       </w:tr>
       <w:tr>
+        <w:trPr>
+          <w:cantSplit/>
+        </w:trPr>
         <w:tc>
           <w:tcPr>
             <w:tcW w:type="dxa" w:w="4986"/>
@@ -9025,6 +9131,9 @@
         </w:tc>
       </w:tr>
       <w:tr>
+        <w:trPr>
+          <w:cantSplit/>
+        </w:trPr>
         <w:tc>
           <w:tcPr>
             <w:tcW w:type="dxa" w:w="4986"/>
@@ -9069,6 +9178,9 @@
         </w:tc>
       </w:tr>
       <w:tr>
+        <w:trPr>
+          <w:cantSplit/>
+        </w:trPr>
         <w:tc>
           <w:tcPr>
             <w:tcW w:type="dxa" w:w="4986"/>
@@ -9113,6 +9225,9 @@
         </w:tc>
       </w:tr>
       <w:tr>
+        <w:trPr>
+          <w:cantSplit/>
+        </w:trPr>
         <w:tc>
           <w:tcPr>
             <w:tcW w:type="dxa" w:w="4986"/>

</xml_diff>